<commit_message>
Semesterunterlagen und Prüfungsübersichten aktualisieren
</commit_message>
<xml_diff>
--- a/projekte/HSBA 2. Semester/modellierung betrieblicher informationssysteme/03_notizen/2026-07-29_persoenlicher-lehrplan_mobis.docx
+++ b/projekte/HSBA 2. Semester/modellierung betrieblicher informationssysteme/03_notizen/2026-07-29_persoenlicher-lehrplan_mobis.docx
@@ -920,7 +920,7 @@
           <w:color w:val="233447"/>
           <w:sz w:val="21"/>
         </w:rPr>
-        <w:t>Gesicherter Modulrahmen: Pflichtmodul, Unterrichtssprache Deutsch, 48 Stunden, 6 Credits und Prüfungsformat Präsentation mit 100 Prozent Gewichtung. Die Projektphase liegt laut Konzept in Woche 7-8; eine vollständige Projektmodellierung kann einen Bonus von 0,3 Notenpunkten bringen. Ein exakter Abgabe- oder Prüfungstermin ist in den vorhandenen Dateien nicht genannt.</w:t>
+        <w:t>Gesicherter Modulrahmen: Pflichtmodul, Deutsch, 48 Stunden und 6 Credits. Die Übungsaufgabe trägt 100 Prozent der Modulnote (Kursinformation 04.08.2026); sie umfasst Aufgabe, Musterlösung und Betreuung in einer 2-3er-Gruppe. Separat kann eine vollständige Projektmodellierung in Woche 7-8 0,3 Notenpunkte Bonus bringen. Termin und Bewertungsrubrik sind offen.</w:t>
       </w:r>
     </w:p>
     <w:p>
@@ -1631,7 +1631,7 @@
                 <w:color w:val="233447"/>
                 <w:rtl w:val="0"/>
               </w:rPr>
-              <w:t>Präsentation 100 Prozent; Gruppen mit 2-3 Studierenden; Übung inklusive Musterlösung und Betreuung.</w:t>
+              <w:t>Übungsaufgabe 100 Prozent der Modulnote (Kursinformation 04.08.2026); Gruppe mit 2-3 Studierenden; Musterlösung und Betreuung.</w:t>
             </w:r>
           </w:p>
         </w:tc>
@@ -10655,7 +10655,7 @@
           <w:color w:val="233447"/>
           <w:sz w:val="21"/>
         </w:rPr>
-        <w:t>Präsentation 100 Prozent; Arbeit in 2-3er-Gruppen; Übungen inklusive Musterlösung und Betreuung; Projektmodellierung in Woche 7-8; 0,3 Notenpunkte Bonus bei vollständiger Modellierung.</w:t>
+        <w:t>Die Übungsaufgabe bestimmt 100 Prozent der Modulnote (Kursinformation 04.08.2026); Arbeit in 2-3er-Gruppen; Aufgabe inklusive Musterlösung und Betreuung; separater Projektbonus von 0,3 Notenpunkten bei vollständiger Modellierung.</w:t>
       </w:r>
     </w:p>
     <w:p>
@@ -10679,7 +10679,7 @@
           <w:color w:val="233447"/>
           <w:sz w:val="21"/>
         </w:rPr>
-        <w:t>Die Konzeptfolie nennt 30-35 Minuten für Themenvorstellungen und kennzeichnet diese zugleich als Dozentenanteil. Deshalb ist nicht gesichert, ob diese Dauer für deine benotete Leistung gilt.</w:t>
+        <w:t>Thema, Aufgabenumfang, Termin, Bewertungsrubrik, Individualanteil und Abgabeformat. Die 30-35 Minuten beziehen sich laut Konzept auf den Dozentenanteil.</w:t>
       </w:r>
     </w:p>
     <w:p>
@@ -13121,7 +13121,7 @@
                 <w:color w:val="233447"/>
                 <w:rtl w:val="0"/>
               </w:rPr>
-              <w:t>Was ist exakt die benotete Präsentationsleistung?</w:t>
+              <w:t>Wie wird die Übungsaufgabe konkret bewertet?</w:t>
             </w:r>
           </w:p>
         </w:tc>
@@ -13155,7 +13155,7 @@
                 <w:color w:val="233447"/>
                 <w:rtl w:val="0"/>
               </w:rPr>
-              <w:t>Präsentation 100 Prozent; Konzept trennt Dozentenpräsentation und studentische Übung.</w:t>
+              <w:t>Kursinfo 04.08.: Übungsaufgabe = 100 %; Konzept belegt Musterlösung und Betreuung.</w:t>
             </w:r>
           </w:p>
         </w:tc>
@@ -13189,7 +13189,7 @@
                 <w:color w:val="233447"/>
                 <w:rtl w:val="0"/>
               </w:rPr>
-              <w:t>Deliverables, Dauer, Rollen und individuelle Bewertung klären.</w:t>
+              <w:t>Rubrik, Umfang, Format und Individualanteil klären.</w:t>
             </w:r>
           </w:p>
         </w:tc>

</xml_diff>